<commit_message>
Update to V article
</commit_message>
<xml_diff>
--- a/assets/The Orinoco Belt Tightens.docx
+++ b/assets/The Orinoco Belt Tightens.docx
@@ -94,11 +94,17 @@
             <w:color w:val="1155CC"/>
             <w:u w:val="single"/>
           </w:rPr>
-          <w:t>capturing Nicholas Maduro</w:t>
+          <w:t>capturing Nicolás Maduro</w:t>
         </w:r>
       </w:hyperlink>
       <w:r>
-        <w:t xml:space="preserve">, the sitting President of Venezuela, in a raid in Caracas. We will leave the ramifications on geopolitics and international law to others that understand far more than us at </w:t>
+        <w:t xml:space="preserve">, the sitting </w:t>
+      </w:r>
+      <w:r>
+        <w:t>p</w:t>
+      </w:r>
+      <w:r>
+        <w:t xml:space="preserve">resident of Venezuela, in a raid in Caracas. We will leave the ramifications on geopolitics and international law to others that understand far more than us at </w:t>
       </w:r>
       <w:r>
         <w:rPr>
@@ -852,14 +858,14 @@
       </w:r>
       <w:r>
         <w:rPr>
-          <w:rFonts w:ascii="Aptos" w:eastAsia="Aptos" w:hAnsi="Aptos" w:cs="Aptos"/>
+          <w:rFonts w:eastAsia="Aptos"/>
           <w:vertAlign w:val="superscript"/>
         </w:rPr>
         <w:footnoteReference w:id="6"/>
       </w:r>
       <w:r>
         <w:rPr>
-          <w:rFonts w:ascii="Aptos" w:eastAsia="Aptos" w:hAnsi="Aptos" w:cs="Aptos"/>
+          <w:rFonts w:eastAsia="Aptos"/>
         </w:rPr>
         <w:t xml:space="preserve"> This legacy of legal uncertainty continues to weigh on investor confidence and on the willingness of international firms to return.</w:t>
       </w:r>
@@ -2113,7 +2119,39 @@
           <w:sz w:val="18"/>
           <w:szCs w:val="18"/>
         </w:rPr>
-        <w:t xml:space="preserve"> that some of the exceptionally high emissions intensities associated with Venezuelan oil today reflect not just the nature of the crude, but the poor state of existing infrastructure in the country. This drives leaks, flaring and inefficiency. Upgrading facilities and capturing methane could reduce upstream emissions even if production stays modest. However, because extra-heavy oil is inherently more energy-intensive to extract and process, these improvements would moderate but not eliminate the carbon-intensity gap with lighter crude sources.</w:t>
+        <w:t xml:space="preserve"> that some of the exceptionally high emissions intensities associated with Venezuelan oil today reflect not just the nature of the crude, but the poor state of existing infrastructure in the country. This drives </w:t>
+      </w:r>
+      <w:r>
+        <w:rPr>
+          <w:rFonts w:ascii="Aptos" w:eastAsia="Aptos" w:hAnsi="Aptos" w:cs="Aptos"/>
+          <w:sz w:val="18"/>
+          <w:szCs w:val="18"/>
+        </w:rPr>
+        <w:t xml:space="preserve">significant </w:t>
+      </w:r>
+      <w:r>
+        <w:rPr>
+          <w:rFonts w:ascii="Aptos" w:eastAsia="Aptos" w:hAnsi="Aptos" w:cs="Aptos"/>
+          <w:sz w:val="18"/>
+          <w:szCs w:val="18"/>
+        </w:rPr>
+        <w:t xml:space="preserve">leaks, flaring and inefficiency. </w:t>
+      </w:r>
+      <w:r>
+        <w:rPr>
+          <w:rFonts w:ascii="Aptos" w:eastAsia="Aptos" w:hAnsi="Aptos" w:cs="Aptos"/>
+          <w:sz w:val="18"/>
+          <w:szCs w:val="18"/>
+        </w:rPr>
+        <w:t>Covering unused wells and otherwise u</w:t>
+      </w:r>
+      <w:r>
+        <w:rPr>
+          <w:rFonts w:ascii="Aptos" w:eastAsia="Aptos" w:hAnsi="Aptos" w:cs="Aptos"/>
+          <w:sz w:val="18"/>
+          <w:szCs w:val="18"/>
+        </w:rPr>
+        <w:t>pgrading facilities could reduce upstream emissions even if production stays modest. However, because extra-heavy oil is inherently more energy-intensive to extract and process, these improvements would moderate but not eliminate the carbon-intensity gap with lighter crude sources.</w:t>
       </w:r>
     </w:p>
   </w:footnote>

</xml_diff>

<commit_message>
Update Venezuela article for typo
</commit_message>
<xml_diff>
--- a/assets/The Orinoco Belt Tightens.docx
+++ b/assets/The Orinoco Belt Tightens.docx
@@ -420,41 +420,15 @@
             <w:color w:val="1155CC"/>
             <w:u w:val="single"/>
           </w:rPr>
-          <w:t xml:space="preserve">around 1,460 kg </w:t>
-        </w:r>
-        <w:proofErr w:type="spellStart"/>
-        <w:r>
-          <w:rPr>
-            <w:color w:val="1155CC"/>
-            <w:u w:val="single"/>
-          </w:rPr>
-          <w:t>CO₂e</w:t>
-        </w:r>
-        <w:proofErr w:type="spellEnd"/>
-        <w:r>
-          <w:rPr>
-            <w:color w:val="1155CC"/>
-            <w:u w:val="single"/>
-          </w:rPr>
-          <w:t xml:space="preserve"> per barrel of oil equivalent</w:t>
+          <w:t>around 1,460 kg CO₂e per barrel of oil equivalent</w:t>
         </w:r>
       </w:hyperlink>
       <w:r>
-        <w:t xml:space="preserve">. This is almost 1,000 times higher than the world’s least carbon intensive reserves, such as Norway’s Johan Sverdrup field (about 1.6 kg </w:t>
-      </w:r>
-      <w:proofErr w:type="spellStart"/>
-      <w:r>
-        <w:t>CO₂e</w:t>
-      </w:r>
-      <w:proofErr w:type="spellEnd"/>
-      <w:r>
-        <w:t>/</w:t>
-      </w:r>
-      <w:proofErr w:type="spellStart"/>
-      <w:r>
-        <w:t>boe</w:t>
-      </w:r>
-      <w:proofErr w:type="spellEnd"/>
+        <w:t>. This is almost 1,000 times higher than the world’s least carbon intensive reserves, such as Norway’s Johan Sverdrup field (about 1.6 kg CO₂e</w:t>
+      </w:r>
+      <w:r>
+        <w:t xml:space="preserve"> per barrel of oil equivalent</w:t>
+      </w:r>
       <w:r>
         <w:t xml:space="preserve">). </w:t>
       </w:r>
@@ -808,21 +782,11 @@
         <w:jc w:val="both"/>
       </w:pPr>
       <w:r>
-        <w:t xml:space="preserve">During the final years of the Punto </w:t>
-      </w:r>
-      <w:proofErr w:type="spellStart"/>
-      <w:r>
-        <w:t>Fijo</w:t>
-      </w:r>
-      <w:proofErr w:type="spellEnd"/>
-      <w:r>
-        <w:t xml:space="preserve"> era in the 1990s, Venezuelan oil production increased year-on-year to a peak of 3.5 million </w:t>
-      </w:r>
-      <w:proofErr w:type="gramStart"/>
-      <w:r>
-        <w:t>barrels  per</w:t>
-      </w:r>
-      <w:proofErr w:type="gramEnd"/>
+        <w:t xml:space="preserve">During the final years of the Punto Fijo era in the 1990s, Venezuelan oil production increased year-on-year to a peak of 3.5 million </w:t>
+      </w:r>
+      <w:r>
+        <w:t>barrels per</w:t>
+      </w:r>
       <w:r>
         <w:t xml:space="preserve"> day (in blue on the chart below). </w:t>
       </w:r>
@@ -846,15 +810,7 @@
         <w:jc w:val="both"/>
       </w:pPr>
       <w:r>
-        <w:t xml:space="preserve">During Hugo Chávez’s presidency, from 1999 to 2013, oil production remained over 2.7 million barrels per day. Chávez’s policies </w:t>
-      </w:r>
-      <w:proofErr w:type="spellStart"/>
-      <w:r>
-        <w:t>nationalised</w:t>
-      </w:r>
-      <w:proofErr w:type="spellEnd"/>
-      <w:r>
-        <w:t xml:space="preserve"> large parts of the oil sector, transferring control of major projects from foreign operators to the state and political appointees, while investment in maintenance and exploration increasingly fell behind. Several of these transfers later became the subject of international arbitration claims by United States and European oil companies, many of which were upheld.</w:t>
+        <w:t>During Hugo Chávez’s presidency, from 1999 to 2013, oil production remained over 2.7 million barrels per day. Chávez’s policies nationalised large parts of the oil sector, transferring control of major projects from foreign operators to the state and political appointees, while investment in maintenance and exploration increasingly fell behind. Several of these transfers later became the subject of international arbitration claims by United States and European oil companies, many of which were upheld.</w:t>
       </w:r>
       <w:r>
         <w:rPr>
@@ -885,7 +841,13 @@
         <w:jc w:val="both"/>
       </w:pPr>
       <w:r>
-        <w:t>Under Nicolás Maduro, oil production collapsed to only 0.7 million barrels per day in 2020, before covering slightly. Deep underinvestment and maintenance neglect weakened infrastructure further, while United States sanctions restricted the export of oil. The heaviness of Venezuela’s crude oil, noted above, also helps explain this decline: unlike lighter grades, production requires continuous investment in infrastructure; without it, production declines are steeper and recovery more costly.</w:t>
+        <w:t xml:space="preserve">Under Nicolás Maduro, oil production collapsed to only 0.7 million barrels per day in 2020, before </w:t>
+      </w:r>
+      <w:r>
+        <w:t>re</w:t>
+      </w:r>
+      <w:r>
+        <w:t>covering slightly. Deep underinvestment and maintenance neglect weakened infrastructure further, while United States sanctions restricted the export of oil. The heaviness of Venezuela’s crude oil, noted above, also helps explain this decline: unlike lighter grades, production requires continuous investment in infrastructure; without it, production declines are steeper and recovery more costly.</w:t>
       </w:r>
     </w:p>
     <w:p>
@@ -1073,15 +1035,7 @@
         <w:t>potential climate consequence</w:t>
       </w:r>
       <w:r>
-        <w:t xml:space="preserve"> of expanding production in Venezuela, without layering in the speculative dynamics like oil prices, OPEC </w:t>
-      </w:r>
-      <w:proofErr w:type="spellStart"/>
-      <w:r>
-        <w:t>behaviour</w:t>
-      </w:r>
-      <w:proofErr w:type="spellEnd"/>
-      <w:r>
-        <w:t xml:space="preserve">, or displacement of other producers. </w:t>
+        <w:t xml:space="preserve"> of expanding production in Venezuela, without layering in the speculative dynamics like oil prices, OPEC behaviour, or displacement of other producers. </w:t>
       </w:r>
     </w:p>
     <w:p>
@@ -1177,15 +1131,7 @@
         <w:jc w:val="both"/>
       </w:pPr>
       <w:r>
-        <w:t xml:space="preserve">Averaged over the period from now to 2050, this level of production translates into around 0.9 </w:t>
-      </w:r>
-      <w:proofErr w:type="spellStart"/>
-      <w:r>
-        <w:t>GtCO</w:t>
-      </w:r>
-      <w:proofErr w:type="spellEnd"/>
-      <w:r>
-        <w:t>₂ per year in emissions — roughly equivalent to co-author Andrew flying home from Europe to New Zealand 430 million times a year. Using standard IPCC estimates, that equates to 0.01°C of warming over the period.</w:t>
+        <w:t>Averaged over the period from now to 2050, this level of production translates into around 0.9 GtCO₂ per year in emissions — roughly equivalent to co-author Andrew flying home from Europe to New Zealand 430 million times a year. Using standard IPCC estimates, that equates to 0.01°C of warming over the period.</w:t>
       </w:r>
     </w:p>
     <w:p>
@@ -1232,28 +1178,11 @@
             <w:color w:val="1155CC"/>
             <w:u w:val="single"/>
           </w:rPr>
-          <w:t xml:space="preserve">analysis from </w:t>
+          <w:t>analysis from ClimatePartner</w:t>
         </w:r>
-        <w:proofErr w:type="spellStart"/>
-        <w:r>
-          <w:rPr>
-            <w:color w:val="1155CC"/>
-            <w:u w:val="single"/>
-          </w:rPr>
-          <w:t>ClimatePartner</w:t>
-        </w:r>
-        <w:proofErr w:type="spellEnd"/>
       </w:hyperlink>
       <w:r>
-        <w:t xml:space="preserve">. In this world, investment returns slowly. Production rises by around 0.5 million barrels per day by 2028, before reaching roughly 1.6 million barrels per day above today’s level by the mid-2030s, where it then </w:t>
-      </w:r>
-      <w:proofErr w:type="spellStart"/>
-      <w:r>
-        <w:t>stabilises</w:t>
-      </w:r>
-      <w:proofErr w:type="spellEnd"/>
-      <w:r>
-        <w:t>.</w:t>
+        <w:t>. In this world, investment returns slowly. Production rises by around 0.5 million barrels per day by 2028, before reaching roughly 1.6 million barrels per day above today’s level by the mid-2030s, where it then stabilises.</w:t>
       </w:r>
     </w:p>
     <w:p>
@@ -1268,11 +1197,9 @@
       <w:r>
         <w:t xml:space="preserve">This path still falls well short of Venezuela’s historical production peak in the </w:t>
       </w:r>
-      <w:proofErr w:type="gramStart"/>
-      <w:r>
-        <w:t>1990s, but</w:t>
-      </w:r>
-      <w:proofErr w:type="gramEnd"/>
+      <w:r>
+        <w:t>1990s but</w:t>
+      </w:r>
       <w:r>
         <w:t xml:space="preserve"> marks a clear break from stagnation. It is consistent with a sanctions relief, renewed access to diluents, </w:t>
       </w:r>
@@ -1293,15 +1220,7 @@
         <w:t xml:space="preserve">means an additional </w:t>
       </w:r>
       <w:r>
-        <w:t xml:space="preserve">0.9 </w:t>
-      </w:r>
-      <w:proofErr w:type="spellStart"/>
-      <w:r>
-        <w:t>GtCO</w:t>
-      </w:r>
-      <w:proofErr w:type="spellEnd"/>
-      <w:r>
-        <w:t>₂ per year</w:t>
+        <w:t>0.9 GtCO₂ per year</w:t>
       </w:r>
       <w:r>
         <w:t xml:space="preserve"> compared to Scenario 0</w:t>
@@ -1372,15 +1291,7 @@
         <w:jc w:val="both"/>
       </w:pPr>
       <w:r>
-        <w:t xml:space="preserve">In this world, capital returns more decisively and institutional conditions improve enough to support large-scale reinvestment. Infrastructure is repaired, skilled </w:t>
-      </w:r>
-      <w:proofErr w:type="spellStart"/>
-      <w:r>
-        <w:t>labour</w:t>
-      </w:r>
-      <w:proofErr w:type="spellEnd"/>
-      <w:r>
-        <w:t xml:space="preserve"> returns, and production steadily recovers. By 2035, output rises from today’s roughly 1.1 million barrels per day back toward Venezuela’s historical peak of around 3.4 million barrels per day.</w:t>
+        <w:t>In this world, capital returns more decisively and institutional conditions improve enough to support large-scale reinvestment. Infrastructure is repaired, skilled labour returns, and production steadily recovers. By 2035, output rises from today’s roughly 1.1 million barrels per day back toward Venezuela’s historical peak of around 3.4 million barrels per day.</w:t>
       </w:r>
       <w:r>
         <w:rPr>
@@ -1398,15 +1309,7 @@
         <w:jc w:val="both"/>
       </w:pPr>
       <w:r>
-        <w:t xml:space="preserve">Averaged over the period to 2050, this scenario adds around 1.3 </w:t>
-      </w:r>
-      <w:proofErr w:type="spellStart"/>
-      <w:r>
-        <w:t>GtCO</w:t>
-      </w:r>
-      <w:proofErr w:type="spellEnd"/>
-      <w:r>
-        <w:t xml:space="preserve">₂ per </w:t>
+        <w:t xml:space="preserve">Averaged over the period to 2050, this scenario adds around 1.3 GtCO₂ per </w:t>
       </w:r>
       <w:proofErr w:type="gramStart"/>
       <w:r>
@@ -1446,15 +1349,7 @@
         <w:jc w:val="both"/>
       </w:pPr>
       <w:r>
-        <w:t xml:space="preserve">This scenario closely resembles the revival implied by United States political narratives that </w:t>
-      </w:r>
-      <w:proofErr w:type="spellStart"/>
-      <w:r>
-        <w:t>emphasise</w:t>
-      </w:r>
-      <w:proofErr w:type="spellEnd"/>
-      <w:r>
-        <w:t xml:space="preserve"> restoring Venezuela’s oil industry to its former strength.</w:t>
+        <w:t>This scenario closely resembles the revival implied by United States political narratives that emphasise restoring Venezuela’s oil industry to its former strength.</w:t>
       </w:r>
     </w:p>
     <w:p>
@@ -1512,15 +1407,7 @@
         <w:jc w:val="both"/>
       </w:pPr>
       <w:r>
-        <w:t xml:space="preserve">In climate terms, this is where the numbers really bite. Averaged over the period to 2050, this scenario adds around 1.9 </w:t>
-      </w:r>
-      <w:proofErr w:type="spellStart"/>
-      <w:r>
-        <w:t>GtCO</w:t>
-      </w:r>
-      <w:proofErr w:type="spellEnd"/>
-      <w:r>
-        <w:t>₂ per year</w:t>
+        <w:t>In climate terms, this is where the numbers really bite. Averaged over the period to 2050, this scenario adds around 1.9 GtCO₂ per year</w:t>
       </w:r>
       <w:r>
         <w:t xml:space="preserve"> compared to Scenario 0</w:t>
@@ -1642,15 +1529,7 @@
         <w:jc w:val="both"/>
       </w:pPr>
       <w:r>
-        <w:t xml:space="preserve">The chart below </w:t>
-      </w:r>
-      <w:proofErr w:type="spellStart"/>
-      <w:r>
-        <w:t>summarises</w:t>
-      </w:r>
-      <w:proofErr w:type="spellEnd"/>
-      <w:r>
-        <w:t xml:space="preserve"> the four production pathways; the main text sets out the reasoning for each. These annual production profiles are the starting point for all subsequent calculations.</w:t>
+        <w:t>The chart below summarises the four production pathways; the main text sets out the reasoning for each. These annual production profiles are the starting point for all subsequent calculations.</w:t>
       </w:r>
     </w:p>
     <w:p>
@@ -1805,15 +1684,7 @@
       </w:pPr>
       <w:r>
         <w:lastRenderedPageBreak/>
-        <w:t xml:space="preserve">Oil production is converted into carbon dioxide emissions using a constant lifecycle emissions factor of 1.89 </w:t>
-      </w:r>
-      <w:proofErr w:type="spellStart"/>
-      <w:r>
-        <w:t>tonnes</w:t>
-      </w:r>
-      <w:proofErr w:type="spellEnd"/>
-      <w:r>
-        <w:t xml:space="preserve"> of CO₂ per barrel, applied uniformly across all scenarios. This factor captures both the emissions released when oil is ultimately burned and the additional emissions associated with extraction, upgrading, transport, and refining — which are particularly significant for Venezuela’s heavy crude.</w:t>
+        <w:t>Oil production is converted into carbon dioxide emissions using a constant lifecycle emissions factor of 1.89 tonnes of CO₂ per barrel, applied uniformly across all scenarios. This factor captures both the emissions released when oil is ultimately burned and the additional emissions associated with extraction, upgrading, transport, and refining — which are particularly significant for Venezuela’s heavy crude.</w:t>
       </w:r>
     </w:p>
     <w:p>
@@ -1822,15 +1693,7 @@
         <w:jc w:val="both"/>
       </w:pPr>
       <w:r>
-        <w:t xml:space="preserve">Applying the same emissions factor in each case ensures that differences across scenarios are driven solely by production volumes, rather than by assumptions about technology, efficiency, or fuel composition. For each scenario, we calculate cumulative emissions over the period from 2025 to 2050, as well as the average annual emissions over that horizon. The scenario descriptions in the main text report these average annual values, expressed in </w:t>
-      </w:r>
-      <w:proofErr w:type="spellStart"/>
-      <w:r>
-        <w:t>gigatonnes</w:t>
-      </w:r>
-      <w:proofErr w:type="spellEnd"/>
-      <w:r>
-        <w:t xml:space="preserve"> of CO₂ per year.</w:t>
+        <w:t>Applying the same emissions factor in each case ensures that differences across scenarios are driven solely by production volumes, rather than by assumptions about technology, efficiency, or fuel composition. For each scenario, we calculate cumulative emissions over the period from 2025 to 2050, as well as the average annual emissions over that horizon. The scenario descriptions in the main text report these average annual values, expressed in gigatonnes of CO₂ per year.</w:t>
       </w:r>
     </w:p>
     <w:p>
@@ -1865,49 +1728,7 @@
         <w:rPr>
           <w:rFonts w:ascii="Aptos" w:eastAsia="Aptos" w:hAnsi="Aptos" w:cs="Aptos"/>
         </w:rPr>
-        <w:t xml:space="preserve">This relationship is known as the Transient Climate Response to Cumulative Emissions of CO₂ (TCRE). This relationship implies that each additional </w:t>
-      </w:r>
-      <w:proofErr w:type="spellStart"/>
-      <w:r>
-        <w:rPr>
-          <w:rFonts w:ascii="Aptos" w:eastAsia="Aptos" w:hAnsi="Aptos" w:cs="Aptos"/>
-        </w:rPr>
-        <w:t>tonne</w:t>
-      </w:r>
-      <w:proofErr w:type="spellEnd"/>
-      <w:r>
-        <w:rPr>
-          <w:rFonts w:ascii="Aptos" w:eastAsia="Aptos" w:hAnsi="Aptos" w:cs="Aptos"/>
-        </w:rPr>
-        <w:t xml:space="preserve"> of CO₂ emissions contributes a roughly constant increment to global warming, around 4.5 × 10⁻¹³ °C per </w:t>
-      </w:r>
-      <w:proofErr w:type="spellStart"/>
-      <w:r>
-        <w:rPr>
-          <w:rFonts w:ascii="Aptos" w:eastAsia="Aptos" w:hAnsi="Aptos" w:cs="Aptos"/>
-        </w:rPr>
-        <w:t>tonne</w:t>
-      </w:r>
-      <w:proofErr w:type="spellEnd"/>
-      <w:r>
-        <w:rPr>
-          <w:rFonts w:ascii="Aptos" w:eastAsia="Aptos" w:hAnsi="Aptos" w:cs="Aptos"/>
-        </w:rPr>
-        <w:t xml:space="preserve"> of CO₂, or 0.00045 °C per </w:t>
-      </w:r>
-      <w:proofErr w:type="spellStart"/>
-      <w:r>
-        <w:rPr>
-          <w:rFonts w:ascii="Aptos" w:eastAsia="Aptos" w:hAnsi="Aptos" w:cs="Aptos"/>
-        </w:rPr>
-        <w:t>gigatonne</w:t>
-      </w:r>
-      <w:proofErr w:type="spellEnd"/>
-      <w:r>
-        <w:rPr>
-          <w:rFonts w:ascii="Aptos" w:eastAsia="Aptos" w:hAnsi="Aptos" w:cs="Aptos"/>
-        </w:rPr>
-        <w:t xml:space="preserve">, largely independent of when those emissions occur. </w:t>
+        <w:t xml:space="preserve">This relationship is known as the Transient Climate Response to Cumulative Emissions of CO₂ (TCRE). This relationship implies that each additional tonne of CO₂ emissions contributes a roughly constant increment to global warming, around 4.5 × 10⁻¹³ °C per tonne of CO₂, or 0.00045 °C per gigatonne, largely independent of when those emissions occur. </w:t>
       </w:r>
       <w:r>
         <w:t>This relationship underpins the concept of a global carbon budget and is widely used in IPCC assessments.</w:t>
@@ -1948,15 +1769,7 @@
         <w:jc w:val="both"/>
       </w:pPr>
       <w:r>
-        <w:t xml:space="preserve">We also express cumulative emissions from each scenario as a share of the remaining global carbon budget consistent with limiting warming to 1.5°C. This is done by comparing total emissions from the scenario with an estimate of the remaining budget of around 170 </w:t>
-      </w:r>
-      <w:proofErr w:type="spellStart"/>
-      <w:r>
-        <w:t>gigatonnes</w:t>
-      </w:r>
-      <w:proofErr w:type="spellEnd"/>
-      <w:r>
-        <w:t xml:space="preserve"> of CO₂.</w:t>
+        <w:t>We also express cumulative emissions from each scenario as a share of the remaining global carbon budget consistent with limiting warming to 1.5°C. This is done by comparing total emissions from the scenario with an estimate of the remaining budget of around 170 gigatonnes of CO₂.</w:t>
       </w:r>
     </w:p>
     <w:p>
@@ -2142,25 +1955,7 @@
           <w:szCs w:val="18"/>
         </w:rPr>
         <w:tab/>
-        <w:t xml:space="preserve">It is worth </w:t>
-      </w:r>
-      <w:proofErr w:type="spellStart"/>
-      <w:r>
-        <w:rPr>
-          <w:rFonts w:ascii="Aptos" w:eastAsia="Aptos" w:hAnsi="Aptos" w:cs="Aptos"/>
-          <w:sz w:val="18"/>
-          <w:szCs w:val="18"/>
-        </w:rPr>
-        <w:t>recognising</w:t>
-      </w:r>
-      <w:proofErr w:type="spellEnd"/>
-      <w:r>
-        <w:rPr>
-          <w:rFonts w:ascii="Aptos" w:eastAsia="Aptos" w:hAnsi="Aptos" w:cs="Aptos"/>
-          <w:sz w:val="18"/>
-          <w:szCs w:val="18"/>
-        </w:rPr>
-        <w:t xml:space="preserve"> that some of the exceptionally high emissions intensities associated with Venezuelan oil today reflect not just the nature of the crude, but the poor state of existing infrastructure in the country. This drives </w:t>
+        <w:t xml:space="preserve">It is worth recognising that some of the exceptionally high emissions intensities associated with Venezuelan oil today reflect not just the nature of the crude, but the poor state of existing infrastructure in the country. This drives </w:t>
       </w:r>
       <w:r>
         <w:rPr>
@@ -2496,23 +2291,7 @@
           <w:sz w:val="18"/>
           <w:szCs w:val="18"/>
         </w:rPr>
-        <w:t xml:space="preserve">. Achieving and sustaining this trajectory would also require legal certainty for foreign investors and a sustained period of </w:t>
-      </w:r>
-      <w:proofErr w:type="spellStart"/>
-      <w:r>
-        <w:rPr>
-          <w:sz w:val="18"/>
-          <w:szCs w:val="18"/>
-        </w:rPr>
-        <w:t>favourable</w:t>
-      </w:r>
-      <w:proofErr w:type="spellEnd"/>
-      <w:r>
-        <w:rPr>
-          <w:sz w:val="18"/>
-          <w:szCs w:val="18"/>
-        </w:rPr>
-        <w:t xml:space="preserve"> oil prices. These are conditions that recent analysis suggests are difficult, but not impossible, to align.</w:t>
+        <w:t>. Achieving and sustaining this trajectory would also require legal certainty for foreign investors and a sustained period of favourable oil prices. These are conditions that recent analysis suggests are difficult, but not impossible, to align.</w:t>
       </w:r>
     </w:p>
   </w:footnote>
@@ -2551,23 +2330,7 @@
           <w:sz w:val="18"/>
           <w:szCs w:val="18"/>
         </w:rPr>
-        <w:t xml:space="preserve">This is a highly optimistic long-run scenario, requiring sustained high oil prices, massive capital </w:t>
-      </w:r>
-      <w:proofErr w:type="spellStart"/>
-      <w:r>
-        <w:rPr>
-          <w:sz w:val="18"/>
-          <w:szCs w:val="18"/>
-        </w:rPr>
-        <w:t>mobilisation</w:t>
-      </w:r>
-      <w:proofErr w:type="spellEnd"/>
-      <w:r>
-        <w:rPr>
-          <w:sz w:val="18"/>
-          <w:szCs w:val="18"/>
-        </w:rPr>
-        <w:t>, and a global market willing to absorb large additional volumes of heavy crude. These are conditions many analysts view as unlikely to persist simultaneously. However, as some reporting has suggested these levels of production, we have considered the Scenario and calculated the associated warming and carbon budget shares.</w:t>
+        <w:t>This is a highly optimistic long-run scenario, requiring sustained high oil prices, massive capital mobilisation, and a global market willing to absorb large additional volumes of heavy crude. These are conditions many analysts view as unlikely to persist simultaneously. However, as some reporting has suggested these levels of production, we have considered the Scenario and calculated the associated warming and carbon budget shares.</w:t>
       </w:r>
     </w:p>
   </w:footnote>

</xml_diff>